<commit_message>
[DCL-35] Tinytype drop scenario document updated
</commit_message>
<xml_diff>
--- a/docs/Scenarios/src/package-drop/Delivery of Whole-blood to Wounded Soldiers with Autonomous Drones.docx
+++ b/docs/Scenarios/src/package-drop/Delivery of Whole-blood to Wounded Soldiers with Autonomous Drones.docx
@@ -282,23 +282,34 @@
     <w:p>
       <w:pPr>
         <w:ind w:firstLine="360"/>
+      </w:pPr>
+      <w:r>
+        <w:lastRenderedPageBreak/>
+        <w:t xml:space="preserve">To address this clear need, our paper will present a novel </w:t>
+      </w:r>
+      <w:r>
+        <w:t>copter-</w:t>
+      </w:r>
+      <w:r>
+        <w:t>based delivery system</w:t>
+      </w:r>
+      <w:r>
+        <w:t xml:space="preserve"> wherein quadcopter drones will perform last mile delivery to geographic locations. These drones will actively use buildings as cover against air defense systems, and can throw the packages directly into open windows.</w:t>
+      </w:r>
+    </w:p>
+    <w:p>
+      <w:pPr>
+        <w:ind w:firstLine="360"/>
         <w:rPr>
           <w:b/>
           <w:bCs/>
         </w:rPr>
       </w:pPr>
       <w:r>
-        <w:lastRenderedPageBreak/>
-        <w:t xml:space="preserve">To address this clear need, our paper will present a novel </w:t>
-      </w:r>
-      <w:r>
-        <w:t>copter-</w:t>
-      </w:r>
-      <w:r>
-        <w:t>based delivery system</w:t>
-      </w:r>
-      <w:r>
-        <w:t xml:space="preserve"> wherein quadcopter drones will perform last mile delivery to geographic locations. These drones will actively use buildings as cover against air defense systems, and can throw the packages directly into open windows. </w:t>
+        <w:t>For the time being, we will focus on the simplest expression of this task – the act of throwing a projectile through a specified target. We will do so using a simple DJI Phantom 4 drone, which will throw a tennis ball through a designated hoop.</w:t>
+      </w:r>
+      <w:r>
+        <w:t xml:space="preserve"> This will serve as a proof of concept for our team, and allow us to petition for funding of a better drone with a larger payload capacity.</w:t>
       </w:r>
     </w:p>
     <w:p>
@@ -313,7 +324,6 @@
         <w:t>Entities</w:t>
       </w:r>
     </w:p>
-    <w:p/>
     <w:p>
       <w:pPr>
         <w:pStyle w:val="ListParagraph"/>
@@ -591,18 +601,23 @@
           <w:numId w:val="1"/>
         </w:numPr>
       </w:pPr>
+      <w:r>
+        <w:t>Visualization</w:t>
+      </w:r>
+    </w:p>
+    <w:p>
       <w:r>
         <w:rPr>
           <w:noProof/>
         </w:rPr>
         <w:drawing>
-          <wp:anchor distT="0" distB="0" distL="114300" distR="114300" simplePos="0" relativeHeight="251680768" behindDoc="0" locked="0" layoutInCell="1" allowOverlap="1" wp14:anchorId="65F6A6CF" wp14:editId="49D82EBE">
+          <wp:anchor distT="0" distB="0" distL="114300" distR="114300" simplePos="0" relativeHeight="251688448" behindDoc="0" locked="0" layoutInCell="1" allowOverlap="1" wp14:anchorId="65F6A6CF" wp14:editId="65785A60">
             <wp:simplePos x="0" y="0"/>
             <wp:positionH relativeFrom="column">
-              <wp:posOffset>1221502</wp:posOffset>
+              <wp:posOffset>1418590</wp:posOffset>
             </wp:positionH>
             <wp:positionV relativeFrom="page">
-              <wp:posOffset>6878955</wp:posOffset>
+              <wp:posOffset>7738745</wp:posOffset>
             </wp:positionV>
             <wp:extent cx="2847975" cy="2258060"/>
             <wp:effectExtent l="0" t="0" r="0" b="0"/>
@@ -658,11 +673,7 @@
           </wp:anchor>
         </w:drawing>
       </w:r>
-      <w:r>
-        <w:t>Visualization</w:t>
-      </w:r>
-    </w:p>
-    <w:p/>
+    </w:p>
     <w:p>
       <w:pPr>
         <w:pStyle w:val="Heading1"/>
@@ -672,6 +683,7 @@
         </w:numPr>
       </w:pPr>
       <w:r>
+        <w:lastRenderedPageBreak/>
         <w:t>State Space</w:t>
       </w:r>
     </w:p>
@@ -1347,7 +1359,6 @@
         </w:numPr>
       </w:pPr>
       <w:r>
-        <w:lastRenderedPageBreak/>
         <w:t xml:space="preserve">The step ID at which the projectile was </w:t>
       </w:r>
       <w:r>
@@ -1826,7 +1837,6 @@
         </w:numPr>
       </w:pPr>
       <w:r>
-        <w:lastRenderedPageBreak/>
         <w:t>Scenario Variations</w:t>
       </w:r>
     </w:p>
@@ -1854,9 +1864,6 @@
         <w:t>Hoops may all be of random size</w:t>
       </w:r>
     </w:p>
-    <w:p/>
-    <w:p/>
-    <w:p/>
     <w:sectPr>
       <w:pgSz w:w="12240" w:h="15840"/>
       <w:pgMar w:top="1440" w:right="1440" w:bottom="1440" w:left="1440" w:header="720" w:footer="720" w:gutter="0"/>

</xml_diff>